<commit_message>
graficos de equipamentos e locais
</commit_message>
<xml_diff>
--- a/relatorio/relatorio_projeto_VA.docx
+++ b/relatorio/relatorio_projeto_VA.docx
@@ -654,7 +654,15 @@
         </w:numPr>
       </w:pPr>
       <w:r>
-        <w:t>Após tratamento, sobraram 225 registros para trabalhar</w:t>
+        <w:t>Após tratamento, sobraram 22</w:t>
+      </w:r>
+      <w:r>
+        <w:t>1</w:t>
+      </w:r>
+      <w:bookmarkStart w:id="0" w:name="_GoBack"/>
+      <w:bookmarkEnd w:id="0"/>
+      <w:r>
+        <w:t xml:space="preserve"> registros para trabalhar</w:t>
       </w:r>
     </w:p>
     <w:p>
@@ -771,8 +779,6 @@
           <w:u w:val="single"/>
         </w:rPr>
       </w:pPr>
-      <w:bookmarkStart w:id="0" w:name="_GoBack"/>
-      <w:bookmarkEnd w:id="0"/>
     </w:p>
     <w:p>
       <w:r>
@@ -4035,6 +4041,7 @@
   <w:style w:type="character" w:default="1" w:styleId="Fontepargpadro">
     <w:name w:val="Default Paragraph Font"/>
     <w:uiPriority w:val="1"/>
+    <w:semiHidden/>
     <w:unhideWhenUsed/>
   </w:style>
   <w:style w:type="table" w:default="1" w:styleId="Tabelanormal">

</xml_diff>